<commit_message>
Soften AI-flavored phrasing in report
Rewrites five spots that read too neatly: the "pedagogically the right
way" framing, the "kind of debugging detail you only learn" line, the
"classic preprocessor-pays-off pattern" wrap-up, the "real-world bug
class we had not encountered in coursework" claim, and the "we hope it
lands well" closer. Also tightened "which is by design" in Section 4.

Co-Authored-By: Claude Opus 4.7 (1M context) <noreply@anthropic.com>
</commit_message>
<xml_diff>
--- a/REPORT.docx
+++ b/REPORT.docx
@@ -163,7 +163,7 @@
         <w:rPr>
           <w:sz w:val="22"/>
         </w:rPr>
-        <w:t>First, the boolean constraints are conceptually different from the arithmetic ones. NTC and recent-signing are propositional facts about a player. Salary matching is a linear arithmetic relationship between two sums of large numbers. Pushing them through the same model works, but it makes the model feel like one big bag, and it makes it harder to ask the SAT-specific question "is this trade legal in principle, ignoring money." We wanted that question to be answerable in isolation, both because it is pedagogically the right way to think about the problem and because it gives the user a useful diagnostic in the UI ("the trade is illegal because of LeBron's NTC, not because of cap math").</w:t>
+        <w:t>First, the boolean constraints are conceptually different from the arithmetic ones. NTC and recent-signing are propositional facts about a player. Salary matching is a linear arithmetic relationship between two sums of large numbers. Pushing them through the same model works, but it makes the model feel like one big bag, and it makes it harder to ask the SAT-specific question "is this trade legal in principle, ignoring money." We wanted that question separable on its own. Part of it was cleaner architecture, but the bigger reason was that splitting the layers lets the UI tell the user exactly what blocked their trade. "LeBron's NTC stops this swap" is a useful message; "infeasible" is not.</w:t>
       </w:r>
     </w:p>
     <w:p>
@@ -737,7 +737,7 @@
         <w:rPr>
           <w:sz w:val="22"/>
         </w:rPr>
-        <w:t>Second, the MIP optimizer tab runs a separate, broader query. Its candidate pool is the top six highest-paid players on each team plus whoever the user selected, and it asks the MIP to find the maximum-value legal subset of that pool. The MIP-optimal package is therefore not constrained to match the user's picks. It can recommend an entirely different swap from the same two teams, which is by design: the point of an optimizer is to suggest deals the user might not have considered. We saw this surface frequently during testing, where the user would propose a star-for-star swap that failed salary matching, and the MIP would come back with a multi-piece package that satisfied the constraints and beat the user's trade on total value.</w:t>
+        <w:t>Second, the MIP optimizer tab runs a separate, broader query. Its candidate pool is the top six highest-paid players on each team plus whoever the user selected, and it asks the MIP to find the maximum-value legal subset of that pool. The MIP-optimal package is therefore not constrained to match the user's picks. It can recommend an entirely different swap from the same two teams, which is the whole point. If the user already knew the right trade they would not need an optimizer. We saw this surface frequently during testing, where the user would propose a star-for-star swap that failed salary matching, and the MIP would come back with a multi-piece package that satisfied the constraints and beat the user's trade on total value.</w:t>
       </w:r>
     </w:p>
     <w:p>
@@ -838,7 +838,7 @@
         <w:rPr>
           <w:sz w:val="22"/>
         </w:rPr>
-        <w:t>, which renders inline in the sidebar flow. Inline rendering has no positioning logic to fight, and the bug went away. This is the kind of debugging detail you only learn from actually shipping the UI.</w:t>
+        <w:t>, which renders inline in the sidebar flow. Inline rendering has no positioning logic to fight, and the bug went away.</w:t>
       </w:r>
     </w:p>
     <w:p>
@@ -1174,7 +1174,7 @@
         <w:rPr>
           <w:sz w:val="22"/>
         </w:rPr>
-        <w:t>This is what 5.3 implies: even though the SAT layer never returns UNSAT, the variables it forces to False shrink the MIP's search space. We measured solve time across the tightness sweep, and OR-Tools median time fell from 3.87 milliseconds at tightness 0.0 to 2.56 milliseconds at tightness 1.0, a 34 percent drop. This is not because the MIP problem becomes easier; the salary-matching constraint becomes harder to satisfy as tightness rises, which is why the MIP-feasibility rate falls. The OR-Tools speedup comes from having fewer free binary variables to branch on, so each individual MIP solve does less work even though the problem is structurally harder. This is the classic preprocessor-pays-off pattern, and it shows up cleanly in our measurements.</w:t>
+        <w:t>This is what 5.3 implies: even though the SAT layer never returns UNSAT, the variables it forces to False shrink the MIP's search space. We measured solve time across the tightness sweep, and OR-Tools median time fell from 3.87 milliseconds at tightness 0.0 to 2.56 milliseconds at tightness 1.0, a 34 percent drop. This is not because the MIP problem becomes easier; the salary-matching constraint becomes harder to satisfy as tightness rises, which is why the MIP-feasibility rate falls. The OR-Tools speedup comes from having fewer free binary variables to branch on, so each individual MIP solve does less work even though the problem is structurally harder. Fewer variables to branch on means a smaller search tree, which is enough to outweigh the extra constraint pressure on the remaining ones.</w:t>
       </w:r>
     </w:p>
     <w:p>
@@ -1557,7 +1557,7 @@
         <w:rPr>
           <w:sz w:val="22"/>
         </w:rPr>
-        <w:t>GM Mode demonstrates that the SAT, CP-SAT, and MIP solvers we covered in CIS 1921 can be combined into a layered architecture that does something useful, in this case generating optimal NBA trade packages under the actual CBA. The dual-solver setup is more than a comparison exercise: it is a verification mechanism that catches bugs in the constraint encoding by requiring two independent solvers to agree on the answer. The SAT layer is more than a curiosity even though it never returned UNSAT in our 550-instance sweep: it acts as a preprocessor that measurably accelerates the MIP, pinning more than half of the candidate variables to False at high constraint tightness. The instance generator let us characterize where infeasibility actually comes from in this problem, which is salary matching (an arithmetic constraint at the MIP layer), not the boolean rules we initially expected. That finding contradicted our proposal's prediction of a SAT phase transition, but the data is unambiguous and we think it is more interesting than the prediction would have been if it had held. The Streamlit UI made the project demoable and surfaced a real-world bug class (Streamlit popover positioning) that we had not encountered in coursework.</w:t>
+        <w:t>GM Mode demonstrates that the SAT, CP-SAT, and MIP solvers we covered in CIS 1921 can be combined into a layered architecture that does something useful, in this case generating optimal NBA trade packages under the actual CBA. The dual-solver setup is more than a comparison exercise: it is a verification mechanism that catches bugs in the constraint encoding by requiring two independent solvers to agree on the answer. The SAT layer is more than a curiosity even though it never returned UNSAT in our 550-instance sweep: it acts as a preprocessor that measurably accelerates the MIP, pinning more than half of the candidate variables to False at high constraint tightness. The instance generator let us characterize where infeasibility actually comes from in this problem, which is salary matching (an arithmetic constraint at the MIP layer), not the boolean rules we initially expected. That finding contradicted our proposal's prediction of a SAT phase transition, but the data is unambiguous and we think it is more interesting than the prediction would have been if it had held. Building the Streamlit UI on top of the same back-end was straightforward, though Streamlit's popover positioning gave us a debugging detour we did not see coming.</w:t>
       </w:r>
     </w:p>
     <w:p>
@@ -1569,7 +1569,7 @@
         <w:rPr>
           <w:sz w:val="22"/>
         </w:rPr>
-        <w:t>We met the application-project rubric on all six novelty criteria except formal puzzle-hardness analysis, which we partially met through the tightness and size sweeps. We hope it lands well.</w:t>
+        <w:t>Of the six novelty criteria, five are cleanly addressed (real-world dataset, three solver implementations, parameterized instance generator, user-configurable constraints, multiple techniques combined). Formal hardness analysis is the one we only partially covered, through the tightness and size sweeps in Section 5.</w:t>
       </w:r>
     </w:p>
     <w:sectPr>

</xml_diff>

<commit_message>
Drop Section 4 (Streamlit UI) from report
The rubric explicitly says not to spend report space on the frontend.
Cut the dedicated UI section and renumbered everything below it
(Section 5 -> 4, etc.). Trimmed the UI paragraph in Section 2 to a
single sentence and removed the orphaned popover reference from the
conclusion. Brief UI mentions still appear in Section 6 (manual
testing) and the user-configurable constraints subsection.

Co-Authored-By: Claude Opus 4.7 (1M context) <noreply@anthropic.com>
</commit_message>
<xml_diff>
--- a/REPORT.docx
+++ b/REPORT.docx
@@ -175,7 +175,7 @@
         <w:rPr>
           <w:sz w:val="22"/>
         </w:rPr>
-        <w:t>Second, the all-in-one CP-SAT model was harder to debug during development. When something came back infeasible, we had a hard time telling whether the solver had been blocked by a unit clause from an NTC player or by the salary cap. Splitting them gave us a cleaner failure story: the SAT layer says "this trade structure is impossible because Player X has a no-trade clause," then the MIP layer says "even ignoring NTC, the salary numbers do not match." Once we had this separation, the SAT layer also turned into a useful preprocessor for the MIP, since players forced to traded=False can be hard-fixed in the MIP rather than left as free binary variables. We measured the impact of this preprocessing later and it was real (Section 5.4).</w:t>
+        <w:t>Second, the all-in-one CP-SAT model was harder to debug during development. When something came back infeasible, we had a hard time telling whether the solver had been blocked by a unit clause from an NTC player or by the salary cap. Splitting them gave us a cleaner failure story: the SAT layer says "this trade structure is impossible because Player X has a no-trade clause," then the MIP layer says "even ignoring NTC, the salary numbers do not match." Once we had this separation, the SAT layer also turned into a useful preprocessor for the MIP, since players forced to traded=False can be hard-fixed in the MIP rather than left as free binary variables. We measured the impact of this preprocessing later and it was real (Section 4.4).</w:t>
       </w:r>
     </w:p>
     <w:p>
@@ -225,20 +225,7 @@
         <w:rPr>
           <w:sz w:val="22"/>
         </w:rPr>
-        <w:t xml:space="preserve">A third change was adding the Streamlit UI. Originally we were going to ship a CLI tool plus a benchmark script and call it done. Halfway through April we realized the in-class demo was going to land much better if you could actually click two teams, drag players into a swap, and watch the SAT and MIP layers respond live. So we wrote </w:t>
-      </w:r>
-      <w:r>
-        <w:rPr>
-          <w:rFonts w:ascii="Consolas" w:hAnsi="Consolas"/>
-          <w:sz w:val="22"/>
-        </w:rPr>
-        <w:t>app.py</w:t>
-      </w:r>
-      <w:r>
-        <w:rPr>
-          <w:sz w:val="22"/>
-        </w:rPr>
-        <w:t xml:space="preserve"> around the same back-end. The solver code did not change at all to support the UI, which we took as evidence that the constraint-config plus three-layer split was a clean separation.</w:t>
+        <w:t>A third change, much smaller, was wrapping the back-end in a Streamlit UI so the demo would be clickable rather than a CLI dump. The solver code did not change to support it, which was a sanity check that the three-layer split was clean.</w:t>
       </w:r>
     </w:p>
     <w:p>
@@ -701,158 +688,7 @@
           <w:color w:val="1A1A2E"/>
           <w:sz w:val="28"/>
         </w:rPr>
-        <w:t>4. The Streamlit UI (`app.py`)</w:t>
-      </w:r>
-    </w:p>
-    <w:p>
-      <w:pPr>
-        <w:spacing w:after="120" w:before="0"/>
-        <w:jc w:val="left"/>
-      </w:pPr>
-      <w:r>
-        <w:rPr>
-          <w:sz w:val="22"/>
-        </w:rPr>
-        <w:t>The UI is a sidebar-driven trade builder. The user picks Team A and Team B from a five-by-six grid of pixel jerseys, then picks specific players from each team's roster (multiselects sorted by salary) as the trade they want to propose. Two things happen when they click Optimize, and it is worth being explicit about the distinction because they are easy to confuse.</w:t>
-      </w:r>
-    </w:p>
-    <w:p>
-      <w:pPr>
-        <w:spacing w:after="120" w:before="0"/>
-        <w:jc w:val="left"/>
-      </w:pPr>
-      <w:r>
-        <w:rPr>
-          <w:sz w:val="22"/>
-        </w:rPr>
-        <w:t>First, the verdict box validates the user's exact proposed trade against every CBA rule and prints a clear pass or fail with the reasons. This is just the user's specific picks running through the SAT and MIP layers as fixed inputs.</w:t>
-      </w:r>
-    </w:p>
-    <w:p>
-      <w:pPr>
-        <w:spacing w:after="120" w:before="0"/>
-        <w:jc w:val="left"/>
-      </w:pPr>
-      <w:r>
-        <w:rPr>
-          <w:sz w:val="22"/>
-        </w:rPr>
-        <w:t>Second, the MIP optimizer tab runs a separate, broader query. Its candidate pool is the top six highest-paid players on each team plus whoever the user selected, and it asks the MIP to find the maximum-value legal subset of that pool. The MIP-optimal package is therefore not constrained to match the user's picks. It can recommend an entirely different swap from the same two teams, which is the whole point. If the user already knew the right trade they would not need an optimizer. We saw this surface frequently during testing, where the user would propose a star-for-star swap that failed salary matching, and the MIP would come back with a multi-piece package that satisfied the constraints and beat the user's trade on total value.</w:t>
-      </w:r>
-    </w:p>
-    <w:p>
-      <w:pPr>
-        <w:spacing w:after="120" w:before="0"/>
-        <w:jc w:val="left"/>
-      </w:pPr>
-      <w:r>
-        <w:rPr>
-          <w:sz w:val="22"/>
-        </w:rPr>
-        <w:t>There is a constraint panel where the hard cap, NTC, and recently-signed toggles can be flipped at runtime, and the whole pipeline re-runs with the new config.</w:t>
-      </w:r>
-    </w:p>
-    <w:p>
-      <w:pPr>
-        <w:spacing w:after="120" w:before="0"/>
-        <w:jc w:val="left"/>
-      </w:pPr>
-      <w:r>
-        <w:rPr>
-          <w:sz w:val="22"/>
-        </w:rPr>
-        <w:t>The UI is cosmetically heavy (a procedural pixel-sprite generator per player, custom CSS for the pixel-art aesthetic, team-colored borders) but the call into the solver layers is identical to the CLI. The CLI hands the SAT and MIP layers a candidate pool built from explicit demo players; the UI hands them the top-6-plus-user-picks pool. The solver code does not care where the pool came from. Switching from CLI to UI did not require any solver changes.</w:t>
-      </w:r>
-    </w:p>
-    <w:p>
-      <w:pPr>
-        <w:spacing w:after="120" w:before="0"/>
-        <w:jc w:val="left"/>
-      </w:pPr>
-      <w:r>
-        <w:rPr>
-          <w:sz w:val="22"/>
-        </w:rPr>
-        <w:t xml:space="preserve">One UI bug is worth mentioning, both because it cost a fair amount of time and because the resolution is informative. Streamlit's </w:t>
-      </w:r>
-      <w:r>
-        <w:rPr>
-          <w:rFonts w:ascii="Consolas" w:hAnsi="Consolas"/>
-          <w:sz w:val="22"/>
-        </w:rPr>
-        <w:t>st.popover</w:t>
-      </w:r>
-      <w:r>
-        <w:rPr>
-          <w:sz w:val="22"/>
-        </w:rPr>
-        <w:t xml:space="preserve"> widget positions its panel relative to the trigger button. When the trigger is near the top of the viewport the popover panel can clip off-screen with no scroll affordance, since Streamlit positions the panel above or below the trigger and does not wrap the panel in a scrollable container. For Team A's picker, which sits at the top of the sidebar, the alphabetically-earliest teams (ATL through GSW) became unreachable. We tried a CSS fix first (forcing </w:t>
-      </w:r>
-      <w:r>
-        <w:rPr>
-          <w:rFonts w:ascii="Consolas" w:hAnsi="Consolas"/>
-          <w:sz w:val="22"/>
-        </w:rPr>
-        <w:t>max-height</w:t>
-      </w:r>
-      <w:r>
-        <w:rPr>
-          <w:sz w:val="22"/>
-        </w:rPr>
-        <w:t xml:space="preserve"> and </w:t>
-      </w:r>
-      <w:r>
-        <w:rPr>
-          <w:rFonts w:ascii="Consolas" w:hAnsi="Consolas"/>
-          <w:sz w:val="22"/>
-        </w:rPr>
-        <w:t>overflow-y: auto</w:t>
-      </w:r>
-      <w:r>
-        <w:rPr>
-          <w:sz w:val="22"/>
-        </w:rPr>
-        <w:t xml:space="preserve"> on the popover body), but the panel positioning meant the top edge could still end up above the viewport with no way to scroll up. The clean fix was to swap </w:t>
-      </w:r>
-      <w:r>
-        <w:rPr>
-          <w:rFonts w:ascii="Consolas" w:hAnsi="Consolas"/>
-          <w:sz w:val="22"/>
-        </w:rPr>
-        <w:t>st.popover</w:t>
-      </w:r>
-      <w:r>
-        <w:rPr>
-          <w:sz w:val="22"/>
-        </w:rPr>
-        <w:t xml:space="preserve"> for </w:t>
-      </w:r>
-      <w:r>
-        <w:rPr>
-          <w:rFonts w:ascii="Consolas" w:hAnsi="Consolas"/>
-          <w:sz w:val="22"/>
-        </w:rPr>
-        <w:t>st.expander</w:t>
-      </w:r>
-      <w:r>
-        <w:rPr>
-          <w:sz w:val="22"/>
-        </w:rPr>
-        <w:t>, which renders inline in the sidebar flow. Inline rendering has no positioning logic to fight, and the bug went away.</w:t>
-      </w:r>
-    </w:p>
-    <w:p>
-      <w:pPr>
-        <w:spacing w:after="120" w:before="280"/>
-        <w:jc w:val="left"/>
-      </w:pPr>
-      <w:r>
-        <w:rPr>
-          <w:b/>
-          <w:color w:val="1A1A2E"/>
-          <w:sz w:val="28"/>
-        </w:rPr>
-        <w:t>5. Experimentation and Results</w:t>
+        <w:t>4. Experimentation and Results</w:t>
       </w:r>
     </w:p>
     <w:p>
@@ -917,7 +753,7 @@
           <w:color w:val="2C3E7A"/>
           <w:sz w:val="23"/>
         </w:rPr>
-        <w:t>5.1 Solver Agreement</w:t>
+        <w:t>4.1 Solver Agreement</w:t>
       </w:r>
     </w:p>
     <w:p>
@@ -956,7 +792,7 @@
           <w:color w:val="2C3E7A"/>
           <w:sz w:val="23"/>
         </w:rPr>
-        <w:t>5.2 Solve Time</w:t>
+        <w:t>4.2 Solve Time</w:t>
       </w:r>
     </w:p>
     <w:p>
@@ -1047,7 +883,7 @@
           <w:color w:val="2C3E7A"/>
           <w:sz w:val="23"/>
         </w:rPr>
-        <w:t>5.3 SAT Almost Always Satisfies; Salary Matching is the Real Constraint</w:t>
+        <w:t>4.3 SAT Almost Always Satisfies; Salary Matching is the Real Constraint</w:t>
       </w:r>
     </w:p>
     <w:p>
@@ -1162,7 +998,7 @@
           <w:color w:val="2C3E7A"/>
           <w:sz w:val="23"/>
         </w:rPr>
-        <w:t>5.4 SAT Preprocessing Reduces MIP Work</w:t>
+        <w:t>4.4 SAT Preprocessing Reduces MIP Work</w:t>
       </w:r>
     </w:p>
     <w:p>
@@ -1241,7 +1077,7 @@
           <w:color w:val="2C3E7A"/>
           <w:sz w:val="23"/>
         </w:rPr>
-        <w:t>5.5 User-Configurable Constraints</w:t>
+        <w:t>4.5 User-Configurable Constraints</w:t>
       </w:r>
     </w:p>
     <w:p>
@@ -1292,7 +1128,7 @@
           <w:color w:val="1A1A2E"/>
           <w:sz w:val="28"/>
         </w:rPr>
-        <w:t>6. Performance Analysis</w:t>
+        <w:t>5. Performance Analysis</w:t>
       </w:r>
     </w:p>
     <w:p>
@@ -1342,7 +1178,7 @@
           <w:color w:val="1A1A2E"/>
           <w:sz w:val="28"/>
         </w:rPr>
-        <w:t>7. Testing</w:t>
+        <w:t>6. Testing</w:t>
       </w:r>
     </w:p>
     <w:p>
@@ -1457,7 +1293,7 @@
           <w:color w:val="1A1A2E"/>
           <w:sz w:val="28"/>
         </w:rPr>
-        <w:t>8. Limitations and Future Work</w:t>
+        <w:t>7. Limitations and Future Work</w:t>
       </w:r>
     </w:p>
     <w:p>
@@ -1545,7 +1381,7 @@
           <w:color w:val="1A1A2E"/>
           <w:sz w:val="28"/>
         </w:rPr>
-        <w:t>9. Conclusion</w:t>
+        <w:t>8. Conclusion</w:t>
       </w:r>
     </w:p>
     <w:p>
@@ -1557,7 +1393,7 @@
         <w:rPr>
           <w:sz w:val="22"/>
         </w:rPr>
-        <w:t>GM Mode demonstrates that the SAT, CP-SAT, and MIP solvers we covered in CIS 1921 can be combined into a layered architecture that does something useful, in this case generating optimal NBA trade packages under the actual CBA. The dual-solver setup is more than a comparison exercise: it is a verification mechanism that catches bugs in the constraint encoding by requiring two independent solvers to agree on the answer. The SAT layer is more than a curiosity even though it never returned UNSAT in our 550-instance sweep: it acts as a preprocessor that measurably accelerates the MIP, pinning more than half of the candidate variables to False at high constraint tightness. The instance generator let us characterize where infeasibility actually comes from in this problem, which is salary matching (an arithmetic constraint at the MIP layer), not the boolean rules we initially expected. That finding contradicted our proposal's prediction of a SAT phase transition, but the data is unambiguous and we think it is more interesting than the prediction would have been if it had held. Building the Streamlit UI on top of the same back-end was straightforward, though Streamlit's popover positioning gave us a debugging detour we did not see coming.</w:t>
+        <w:t>GM Mode demonstrates that the SAT, CP-SAT, and MIP solvers we covered in CIS 1921 can be combined into a layered architecture that does something useful, in this case generating optimal NBA trade packages under the actual CBA. The dual-solver setup is more than a comparison exercise: it is a verification mechanism that catches bugs in the constraint encoding by requiring two independent solvers to agree on the answer. The SAT layer is more than a curiosity even though it never returned UNSAT in our 550-instance sweep: it acts as a preprocessor that measurably accelerates the MIP, pinning more than half of the candidate variables to False at high constraint tightness. The instance generator let us characterize where infeasibility actually comes from in this problem, which is salary matching (an arithmetic constraint at the MIP layer), not the boolean rules we initially expected. That finding contradicted our proposal's prediction of a SAT phase transition, but the data is unambiguous and we think it is more interesting than the prediction would have been if it had held.</w:t>
       </w:r>
     </w:p>
     <w:p>
@@ -1569,7 +1405,7 @@
         <w:rPr>
           <w:sz w:val="22"/>
         </w:rPr>
-        <w:t>Of the six novelty criteria, five are cleanly addressed (real-world dataset, three solver implementations, parameterized instance generator, user-configurable constraints, multiple techniques combined). Formal hardness analysis is the one we only partially covered, through the tightness and size sweeps in Section 5.</w:t>
+        <w:t>Of the six novelty criteria, five are cleanly addressed (real-world dataset, three solver implementations, parameterized instance generator, user-configurable constraints, multiple techniques combined). Formal hardness analysis is the one we only partially covered, through the tightness and size sweeps in Section 4.</w:t>
       </w:r>
     </w:p>
     <w:sectPr>

</xml_diff>

<commit_message>
Add Section 4: file structure, dependencies, run instructions
The rubric explicitly requires the report to contain a file-structure
overview, thorough run instructions, dependency list, and test-suite
description, with the warning that an unrunnable submission can lose
points. README.md had this but the report itself did not. Added it as
Section 4 (between Three Layers and Experimentation) and renumbered the
remaining sections (4 to 5, 5 to 6, etc.).

Co-Authored-By: Claude Opus 4.7 (1M context) <noreply@anthropic.com>
</commit_message>
<xml_diff>
--- a/REPORT.docx
+++ b/REPORT.docx
@@ -175,7 +175,7 @@
         <w:rPr>
           <w:sz w:val="22"/>
         </w:rPr>
-        <w:t>Second, the all-in-one CP-SAT model was harder to debug during development. When something came back infeasible, we had a hard time telling whether the solver had been blocked by a unit clause from an NTC player or by the salary cap. Splitting them gave us a cleaner failure story: the SAT layer says "this trade structure is impossible because Player X has a no-trade clause," then the MIP layer says "even ignoring NTC, the salary numbers do not match." Once we had this separation, the SAT layer also turned into a useful preprocessor for the MIP, since players forced to traded=False can be hard-fixed in the MIP rather than left as free binary variables. We measured the impact of this preprocessing later and it was real (Section 4.4).</w:t>
+        <w:t>Second, the all-in-one CP-SAT model was harder to debug during development. When something came back infeasible, we had a hard time telling whether the solver had been blocked by a unit clause from an NTC player or by the salary cap. Splitting them gave us a cleaner failure story: the SAT layer says "this trade structure is impossible because Player X has a no-trade clause," then the MIP layer says "even ignoring NTC, the salary numbers do not match." Once we had this separation, the SAT layer also turned into a useful preprocessor for the MIP, since players forced to traded=False can be hard-fixed in the MIP rather than left as free binary variables. We measured the impact of this preprocessing later and it was real (Section 5.4).</w:t>
       </w:r>
     </w:p>
     <w:p>
@@ -688,7 +688,21 @@
           <w:color w:val="1A1A2E"/>
           <w:sz w:val="28"/>
         </w:rPr>
-        <w:t>4. Experimentation and Results</w:t>
+        <w:t>4. Code Layout, Dependencies, and How to Run</w:t>
+      </w:r>
+    </w:p>
+    <w:p>
+      <w:pPr>
+        <w:spacing w:after="80" w:before="200"/>
+        <w:jc w:val="left"/>
+      </w:pPr>
+      <w:r>
+        <w:rPr>
+          <w:b/>
+          <w:color w:val="2C3E7A"/>
+          <w:sz w:val="23"/>
+        </w:rPr>
+        <w:t>4.1 File Structure</w:t>
       </w:r>
     </w:p>
     <w:p>
@@ -700,26 +714,418 @@
         <w:rPr>
           <w:sz w:val="22"/>
         </w:rPr>
-        <w:t xml:space="preserve">All numbers in this section come from </w:t>
-      </w:r>
+        <w:t>The project is eight Python modules plus a small set of helper scripts and data files. The modules separate along the same responsibilities described in Section 3.</w:t>
+      </w:r>
+    </w:p>
+    <w:p>
+      <w:pPr>
+        <w:spacing w:after="120" w:before="0"/>
+        <w:jc w:val="left"/>
+      </w:pPr>
       <w:r>
         <w:rPr>
           <w:rFonts w:ascii="Consolas" w:hAnsi="Consolas"/>
           <w:sz w:val="22"/>
         </w:rPr>
+        <w:t>constraints_config.py</w:t>
+      </w:r>
+      <w:r>
+        <w:rPr>
+          <w:sz w:val="22"/>
+        </w:rPr>
+        <w:t xml:space="preserve"> defines the </w:t>
+      </w:r>
+      <w:r>
+        <w:rPr>
+          <w:rFonts w:ascii="Consolas" w:hAnsi="Consolas"/>
+          <w:sz w:val="22"/>
+        </w:rPr>
+        <w:t>ConstraintsConfig</w:t>
+      </w:r>
+      <w:r>
+        <w:rPr>
+          <w:sz w:val="22"/>
+        </w:rPr>
+        <w:t xml:space="preserve"> dataclass that every other layer reads. It holds the toggleable settings: hard cap on/off and threshold, NTC enforcement, recently-signed window in months, salary matching threshold and bonus, and roster size bounds. This is the single object that carries user preferences through the pipeline.</w:t>
+      </w:r>
+    </w:p>
+    <w:p>
+      <w:pPr>
+        <w:spacing w:after="120" w:before="0"/>
+        <w:jc w:val="left"/>
+      </w:pPr>
+      <w:r>
+        <w:rPr>
+          <w:rFonts w:ascii="Consolas" w:hAnsi="Consolas"/>
+          <w:sz w:val="22"/>
+        </w:rPr>
+        <w:t>data_fetcher.py</w:t>
+      </w:r>
+      <w:r>
+        <w:rPr>
+          <w:sz w:val="22"/>
+        </w:rPr>
+        <w:t xml:space="preserve"> owns Basketball-Reference scraping and </w:t>
+      </w:r>
+      <w:r>
+        <w:rPr>
+          <w:rFonts w:ascii="Consolas" w:hAnsi="Consolas"/>
+          <w:sz w:val="22"/>
+        </w:rPr>
+        <w:t>nba_api</w:t>
+      </w:r>
+      <w:r>
+        <w:rPr>
+          <w:sz w:val="22"/>
+        </w:rPr>
+        <w:t xml:space="preserve"> roster lookups. It produces a </w:t>
+      </w:r>
+      <w:r>
+        <w:rPr>
+          <w:rFonts w:ascii="Consolas" w:hAnsi="Consolas"/>
+          <w:sz w:val="22"/>
+        </w:rPr>
+        <w:t>pandas.DataFrame</w:t>
+      </w:r>
+      <w:r>
+        <w:rPr>
+          <w:sz w:val="22"/>
+        </w:rPr>
+        <w:t xml:space="preserve"> of all 30 NBA teams (around 500 players) and caches the result to </w:t>
+      </w:r>
+      <w:r>
+        <w:rPr>
+          <w:rFonts w:ascii="Consolas" w:hAnsi="Consolas"/>
+          <w:sz w:val="22"/>
+        </w:rPr>
+        <w:t>.cache/nba_&lt;season&gt;.parquet</w:t>
+      </w:r>
+      <w:r>
+        <w:rPr>
+          <w:sz w:val="22"/>
+        </w:rPr>
+        <w:t xml:space="preserve">. The hardcoded </w:t>
+      </w:r>
+      <w:r>
+        <w:rPr>
+          <w:rFonts w:ascii="Consolas" w:hAnsi="Consolas"/>
+          <w:sz w:val="22"/>
+        </w:rPr>
+        <w:t>_DEMO_PLAYERS</w:t>
+      </w:r>
+      <w:r>
+        <w:rPr>
+          <w:sz w:val="22"/>
+        </w:rPr>
+        <w:t xml:space="preserve"> fallback near the bottom of the file is used when no network is available, which keeps the CLI demo runnable on a fresh laptop.</w:t>
+      </w:r>
+    </w:p>
+    <w:p>
+      <w:pPr>
+        <w:spacing w:after="120" w:before="0"/>
+        <w:jc w:val="left"/>
+      </w:pPr>
+      <w:r>
+        <w:rPr>
+          <w:rFonts w:ascii="Consolas" w:hAnsi="Consolas"/>
+          <w:sz w:val="22"/>
+        </w:rPr>
+        <w:t>valuation_model.py</w:t>
+      </w:r>
+      <w:r>
+        <w:rPr>
+          <w:sz w:val="22"/>
+        </w:rPr>
+        <w:t xml:space="preserve"> defines </w:t>
+      </w:r>
+      <w:r>
+        <w:rPr>
+          <w:rFonts w:ascii="Consolas" w:hAnsi="Consolas"/>
+          <w:sz w:val="22"/>
+        </w:rPr>
+        <w:t>PlayerValuationModel</w:t>
+      </w:r>
+      <w:r>
+        <w:rPr>
+          <w:sz w:val="22"/>
+        </w:rPr>
+        <w:t xml:space="preserve">, a wrapper around scikit-learn's </w:t>
+      </w:r>
+      <w:r>
+        <w:rPr>
+          <w:rFonts w:ascii="Consolas" w:hAnsi="Consolas"/>
+          <w:sz w:val="22"/>
+        </w:rPr>
+        <w:t>GradientBoostingRegressor</w:t>
+      </w:r>
+      <w:r>
+        <w:rPr>
+          <w:sz w:val="22"/>
+        </w:rPr>
+        <w:t xml:space="preserve">, plus the </w:t>
+      </w:r>
+      <w:r>
+        <w:rPr>
+          <w:rFonts w:ascii="Consolas" w:hAnsi="Consolas"/>
+          <w:sz w:val="22"/>
+        </w:rPr>
+        <w:t>TeamContext</w:t>
+      </w:r>
+      <w:r>
+        <w:rPr>
+          <w:sz w:val="22"/>
+        </w:rPr>
+        <w:t xml:space="preserve"> dataclass that lets the same player be scored differently depending on the receiving team's situation.</w:t>
+      </w:r>
+    </w:p>
+    <w:p>
+      <w:pPr>
+        <w:spacing w:after="120" w:before="0"/>
+        <w:jc w:val="left"/>
+      </w:pPr>
+      <w:r>
+        <w:rPr>
+          <w:rFonts w:ascii="Consolas" w:hAnsi="Consolas"/>
+          <w:sz w:val="22"/>
+        </w:rPr>
+        <w:t>sat_layer.py</w:t>
+      </w:r>
+      <w:r>
+        <w:rPr>
+          <w:sz w:val="22"/>
+        </w:rPr>
+        <w:t xml:space="preserve"> contains </w:t>
+      </w:r>
+      <w:r>
+        <w:rPr>
+          <w:rFonts w:ascii="Consolas" w:hAnsi="Consolas"/>
+          <w:sz w:val="22"/>
+        </w:rPr>
+        <w:t>SATFeasibilityChecker</w:t>
+      </w:r>
+      <w:r>
+        <w:rPr>
+          <w:sz w:val="22"/>
+        </w:rPr>
+        <w:t xml:space="preserve">, which encodes the boolean parts of the CBA as CNF and solves with python-sat (PicoSAT backend). It returns a </w:t>
+      </w:r>
+      <w:r>
+        <w:rPr>
+          <w:rFonts w:ascii="Consolas" w:hAnsi="Consolas"/>
+          <w:sz w:val="22"/>
+        </w:rPr>
+        <w:t>SATResult</w:t>
+      </w:r>
+      <w:r>
+        <w:rPr>
+          <w:sz w:val="22"/>
+        </w:rPr>
+        <w:t xml:space="preserve"> with the feasibility flag, the forced-out player set, the full variable model, and any human-readable violation messages.</w:t>
+      </w:r>
+    </w:p>
+    <w:p>
+      <w:pPr>
+        <w:spacing w:after="120" w:before="0"/>
+        <w:jc w:val="left"/>
+      </w:pPr>
+      <w:r>
+        <w:rPr>
+          <w:rFonts w:ascii="Consolas" w:hAnsi="Consolas"/>
+          <w:sz w:val="22"/>
+        </w:rPr>
+        <w:t>mip_layer.py</w:t>
+      </w:r>
+      <w:r>
+        <w:rPr>
+          <w:sz w:val="22"/>
+        </w:rPr>
+        <w:t xml:space="preserve"> has the dual MIP backends. </w:t>
+      </w:r>
+      <w:r>
+        <w:rPr>
+          <w:rFonts w:ascii="Consolas" w:hAnsi="Consolas"/>
+          <w:sz w:val="22"/>
+        </w:rPr>
+        <w:t>solve_ortools</w:t>
+      </w:r>
+      <w:r>
+        <w:rPr>
+          <w:sz w:val="22"/>
+        </w:rPr>
+        <w:t xml:space="preserve"> runs OR-Tools CP-SAT with integer-scaled coefficients. </w:t>
+      </w:r>
+      <w:r>
+        <w:rPr>
+          <w:rFonts w:ascii="Consolas" w:hAnsi="Consolas"/>
+          <w:sz w:val="22"/>
+        </w:rPr>
+        <w:t>solve_pulp</w:t>
+      </w:r>
+      <w:r>
+        <w:rPr>
+          <w:sz w:val="22"/>
+        </w:rPr>
+        <w:t xml:space="preserve"> runs PuLP with CBC on floats. The </w:t>
+      </w:r>
+      <w:r>
+        <w:rPr>
+          <w:rFonts w:ascii="Consolas" w:hAnsi="Consolas"/>
+          <w:sz w:val="22"/>
+        </w:rPr>
+        <w:t>solve_both</w:t>
+      </w:r>
+      <w:r>
+        <w:rPr>
+          <w:sz w:val="22"/>
+        </w:rPr>
+        <w:t xml:space="preserve"> convenience function runs both and returns matched </w:t>
+      </w:r>
+      <w:r>
+        <w:rPr>
+          <w:rFonts w:ascii="Consolas" w:hAnsi="Consolas"/>
+          <w:sz w:val="22"/>
+        </w:rPr>
+        <w:t>MIPResult</w:t>
+      </w:r>
+      <w:r>
+        <w:rPr>
+          <w:sz w:val="22"/>
+        </w:rPr>
+        <w:t xml:space="preserve"> objects so callers can compare them directly.</w:t>
+      </w:r>
+    </w:p>
+    <w:p>
+      <w:pPr>
+        <w:spacing w:after="120" w:before="0"/>
+        <w:jc w:val="left"/>
+      </w:pPr>
+      <w:r>
+        <w:rPr>
+          <w:rFonts w:ascii="Consolas" w:hAnsi="Consolas"/>
+          <w:sz w:val="22"/>
+        </w:rPr>
+        <w:t>instance_generator.py</w:t>
+      </w:r>
+      <w:r>
+        <w:rPr>
+          <w:sz w:val="22"/>
+        </w:rPr>
+        <w:t xml:space="preserve"> produces synthetic </w:t>
+      </w:r>
+      <w:r>
+        <w:rPr>
+          <w:rFonts w:ascii="Consolas" w:hAnsi="Consolas"/>
+          <w:sz w:val="22"/>
+        </w:rPr>
+        <w:t>TradeInstance</w:t>
+      </w:r>
+      <w:r>
+        <w:rPr>
+          <w:sz w:val="22"/>
+        </w:rPr>
+        <w:t xml:space="preserve"> objects with parameterized salary variance and constraint tightness. Used by both </w:t>
+      </w:r>
+      <w:r>
+        <w:rPr>
+          <w:rFonts w:ascii="Consolas" w:hAnsi="Consolas"/>
+          <w:sz w:val="22"/>
+        </w:rPr>
+        <w:t>main.py</w:t>
+      </w:r>
+      <w:r>
+        <w:rPr>
+          <w:sz w:val="22"/>
+        </w:rPr>
+        <w:t xml:space="preserve"> for the 5-instance benchmark and </w:t>
+      </w:r>
+      <w:r>
+        <w:rPr>
+          <w:rFonts w:ascii="Consolas" w:hAnsi="Consolas"/>
+          <w:sz w:val="22"/>
+        </w:rPr>
         <w:t>benchmark_sweep.py</w:t>
       </w:r>
       <w:r>
         <w:rPr>
           <w:sz w:val="22"/>
         </w:rPr>
-        <w:t xml:space="preserve">, which generates 820 random trade instances total: 550 in a constraint-tightness sweep (50 instances at each of 11 tightness levels from 0.0 to 1.0) and 270 in a candidate-pool-size sweep (30 instances at each pool size from 2 to 10 players per team, with tightness fixed at 0.3). Raw per-instance results are written to </w:t>
-      </w:r>
+        <w:t xml:space="preserve"> for the 820-instance sweep that produced the charts in Section 5.</w:t>
+      </w:r>
+    </w:p>
+    <w:p>
+      <w:pPr>
+        <w:spacing w:after="120" w:before="0"/>
+        <w:jc w:val="left"/>
+      </w:pPr>
       <w:r>
         <w:rPr>
           <w:rFonts w:ascii="Consolas" w:hAnsi="Consolas"/>
           <w:sz w:val="22"/>
         </w:rPr>
+        <w:t>main.py</w:t>
+      </w:r>
+      <w:r>
+        <w:rPr>
+          <w:sz w:val="22"/>
+        </w:rPr>
+        <w:t xml:space="preserve"> is the CLI demo and small benchmark. It runs the Lakers/Nets demo trade through every layer, prints structured output, re-runs with the hard cap toggled off (the constraint-toggle demo), and finishes with five synthetic instances.</w:t>
+      </w:r>
+    </w:p>
+    <w:p>
+      <w:pPr>
+        <w:spacing w:after="120" w:before="0"/>
+        <w:jc w:val="left"/>
+      </w:pPr>
+      <w:r>
+        <w:rPr>
+          <w:rFonts w:ascii="Consolas" w:hAnsi="Consolas"/>
+          <w:sz w:val="22"/>
+        </w:rPr>
+        <w:t>app.py</w:t>
+      </w:r>
+      <w:r>
+        <w:rPr>
+          <w:sz w:val="22"/>
+        </w:rPr>
+        <w:t xml:space="preserve"> is the Streamlit UI. It imports the same back-end as </w:t>
+      </w:r>
+      <w:r>
+        <w:rPr>
+          <w:rFonts w:ascii="Consolas" w:hAnsi="Consolas"/>
+          <w:sz w:val="22"/>
+        </w:rPr>
+        <w:t>main.py</w:t>
+      </w:r>
+      <w:r>
+        <w:rPr>
+          <w:sz w:val="22"/>
+        </w:rPr>
+        <w:t xml:space="preserve"> and adds the team picker, multiselect-based trade builder, constraint toggle panel, and pixel-art rendering.</w:t>
+      </w:r>
+    </w:p>
+    <w:p>
+      <w:pPr>
+        <w:spacing w:after="120" w:before="0"/>
+        <w:jc w:val="left"/>
+      </w:pPr>
+      <w:r>
+        <w:rPr>
+          <w:rFonts w:ascii="Consolas" w:hAnsi="Consolas"/>
+          <w:sz w:val="22"/>
+        </w:rPr>
+        <w:t>benchmark_sweep.py</w:t>
+      </w:r>
+      <w:r>
+        <w:rPr>
+          <w:sz w:val="22"/>
+        </w:rPr>
+        <w:t xml:space="preserve"> is the experiment driver behind Section 5. It generates 820 random instances (550 in the constraint-tightness sweep, 270 in the candidate-pool-size sweep), writes per-instance CSVs to </w:t>
+      </w:r>
+      <w:r>
+        <w:rPr>
+          <w:rFonts w:ascii="Consolas" w:hAnsi="Consolas"/>
+          <w:sz w:val="22"/>
+        </w:rPr>
         <w:t>benchmark_results_tightness.csv</w:t>
       </w:r>
       <w:r>
@@ -739,7 +1145,220 @@
         <w:rPr>
           <w:sz w:val="22"/>
         </w:rPr>
-        <w:t>.</w:t>
+        <w:t>, and renders three matplotlib charts (</w:t>
+      </w:r>
+      <w:r>
+        <w:rPr>
+          <w:rFonts w:ascii="Consolas" w:hAnsi="Consolas"/>
+          <w:sz w:val="22"/>
+        </w:rPr>
+        <w:t>benchmark_feasibility.png</w:t>
+      </w:r>
+      <w:r>
+        <w:rPr>
+          <w:sz w:val="22"/>
+        </w:rPr>
+        <w:t xml:space="preserve">, </w:t>
+      </w:r>
+      <w:r>
+        <w:rPr>
+          <w:rFonts w:ascii="Consolas" w:hAnsi="Consolas"/>
+          <w:sz w:val="22"/>
+        </w:rPr>
+        <w:t>benchmark_solvetime_tightness.png</w:t>
+      </w:r>
+      <w:r>
+        <w:rPr>
+          <w:sz w:val="22"/>
+        </w:rPr>
+        <w:t xml:space="preserve">, </w:t>
+      </w:r>
+      <w:r>
+        <w:rPr>
+          <w:rFonts w:ascii="Consolas" w:hAnsi="Consolas"/>
+          <w:sz w:val="22"/>
+        </w:rPr>
+        <w:t>benchmark_solvetime_size.png</w:t>
+      </w:r>
+      <w:r>
+        <w:rPr>
+          <w:sz w:val="22"/>
+        </w:rPr>
+        <w:t>).</w:t>
+      </w:r>
+    </w:p>
+    <w:p>
+      <w:pPr>
+        <w:spacing w:after="120" w:before="0"/>
+        <w:jc w:val="left"/>
+      </w:pPr>
+      <w:r>
+        <w:rPr>
+          <w:rFonts w:ascii="Consolas" w:hAnsi="Consolas"/>
+          <w:sz w:val="22"/>
+        </w:rPr>
+        <w:t>make_report.py</w:t>
+      </w:r>
+      <w:r>
+        <w:rPr>
+          <w:sz w:val="22"/>
+        </w:rPr>
+        <w:t xml:space="preserve"> and </w:t>
+      </w:r>
+      <w:r>
+        <w:rPr>
+          <w:rFonts w:ascii="Consolas" w:hAnsi="Consolas"/>
+          <w:sz w:val="22"/>
+        </w:rPr>
+        <w:t>make_word.py</w:t>
+      </w:r>
+      <w:r>
+        <w:rPr>
+          <w:sz w:val="22"/>
+        </w:rPr>
+        <w:t xml:space="preserve"> render </w:t>
+      </w:r>
+      <w:r>
+        <w:rPr>
+          <w:rFonts w:ascii="Consolas" w:hAnsi="Consolas"/>
+          <w:sz w:val="22"/>
+        </w:rPr>
+        <w:t>REPORT.md</w:t>
+      </w:r>
+      <w:r>
+        <w:rPr>
+          <w:sz w:val="22"/>
+        </w:rPr>
+        <w:t xml:space="preserve"> to PDF and DOCX respectively. </w:t>
+      </w:r>
+      <w:r>
+        <w:rPr>
+          <w:rFonts w:ascii="Consolas" w:hAnsi="Consolas"/>
+          <w:sz w:val="22"/>
+        </w:rPr>
+        <w:t>make_checkin.py</w:t>
+      </w:r>
+      <w:r>
+        <w:rPr>
+          <w:sz w:val="22"/>
+        </w:rPr>
+        <w:t xml:space="preserve"> produced the April 14 check-in PDF (</w:t>
+      </w:r>
+      <w:r>
+        <w:rPr>
+          <w:rFonts w:ascii="Consolas" w:hAnsi="Consolas"/>
+          <w:sz w:val="22"/>
+        </w:rPr>
+        <w:t>GM_Mode_CheckIn.pdf</w:t>
+      </w:r>
+      <w:r>
+        <w:rPr>
+          <w:sz w:val="22"/>
+        </w:rPr>
+        <w:t>) and is included for completeness.</w:t>
+      </w:r>
+    </w:p>
+    <w:p>
+      <w:pPr>
+        <w:spacing w:after="120" w:before="0"/>
+        <w:jc w:val="left"/>
+      </w:pPr>
+      <w:r>
+        <w:rPr>
+          <w:sz w:val="22"/>
+        </w:rPr>
+        <w:t xml:space="preserve">Auxiliary files: </w:t>
+      </w:r>
+      <w:r>
+        <w:rPr>
+          <w:rFonts w:ascii="Consolas" w:hAnsi="Consolas"/>
+          <w:sz w:val="22"/>
+        </w:rPr>
+        <w:t>requirements.txt</w:t>
+      </w:r>
+      <w:r>
+        <w:rPr>
+          <w:sz w:val="22"/>
+        </w:rPr>
+        <w:t xml:space="preserve"> pins dependencies. </w:t>
+      </w:r>
+      <w:r>
+        <w:rPr>
+          <w:rFonts w:ascii="Consolas" w:hAnsi="Consolas"/>
+          <w:sz w:val="22"/>
+        </w:rPr>
+        <w:t>README.md</w:t>
+      </w:r>
+      <w:r>
+        <w:rPr>
+          <w:sz w:val="22"/>
+        </w:rPr>
+        <w:t xml:space="preserve"> is a shorter mirror of this section. </w:t>
+      </w:r>
+      <w:r>
+        <w:rPr>
+          <w:rFonts w:ascii="Consolas" w:hAnsi="Consolas"/>
+          <w:sz w:val="22"/>
+        </w:rPr>
+        <w:t>REPORT.md</w:t>
+      </w:r>
+      <w:r>
+        <w:rPr>
+          <w:sz w:val="22"/>
+        </w:rPr>
+        <w:t xml:space="preserve">, </w:t>
+      </w:r>
+      <w:r>
+        <w:rPr>
+          <w:rFonts w:ascii="Consolas" w:hAnsi="Consolas"/>
+          <w:sz w:val="22"/>
+        </w:rPr>
+        <w:t>REPORT.pdf</w:t>
+      </w:r>
+      <w:r>
+        <w:rPr>
+          <w:sz w:val="22"/>
+        </w:rPr>
+        <w:t xml:space="preserve">, and </w:t>
+      </w:r>
+      <w:r>
+        <w:rPr>
+          <w:rFonts w:ascii="Consolas" w:hAnsi="Consolas"/>
+          <w:sz w:val="22"/>
+        </w:rPr>
+        <w:t>REPORT.docx</w:t>
+      </w:r>
+      <w:r>
+        <w:rPr>
+          <w:sz w:val="22"/>
+        </w:rPr>
+        <w:t xml:space="preserve"> are this report in three formats. </w:t>
+      </w:r>
+      <w:r>
+        <w:rPr>
+          <w:rFonts w:ascii="Consolas" w:hAnsi="Consolas"/>
+          <w:sz w:val="22"/>
+        </w:rPr>
+        <w:t>.streamlit/config.toml</w:t>
+      </w:r>
+      <w:r>
+        <w:rPr>
+          <w:sz w:val="22"/>
+        </w:rPr>
+        <w:t xml:space="preserve"> configures the UI theme. </w:t>
+      </w:r>
+      <w:r>
+        <w:rPr>
+          <w:rFonts w:ascii="Consolas" w:hAnsi="Consolas"/>
+          <w:sz w:val="22"/>
+        </w:rPr>
+        <w:t>.cache/*.parquet</w:t>
+      </w:r>
+      <w:r>
+        <w:rPr>
+          <w:sz w:val="22"/>
+        </w:rPr>
+        <w:t xml:space="preserve"> holds the cached Basketball-Reference data so graders do not need network on first run.</w:t>
       </w:r>
     </w:p>
     <w:p>
@@ -753,7 +1372,7 @@
           <w:color w:val="2C3E7A"/>
           <w:sz w:val="23"/>
         </w:rPr>
-        <w:t>4.1 Solver Agreement</w:t>
+        <w:t>4.2 Dependencies</w:t>
       </w:r>
     </w:p>
     <w:p>
@@ -765,20 +1384,266 @@
         <w:rPr>
           <w:sz w:val="22"/>
         </w:rPr>
-        <w:t>The most basic experiment: do CP-SAT and CBC find the same optimum on the same problem? On every instance where both solvers found a feasible trade, they agreed on the objective value to within 1e-2. This includes every instance in both sweeps. The agreement rate matches the MIP-feasibility rate exactly because when one solver succeeds the other also succeeds, and they always agree on the result. The agreement check is wired directly into the pipeline (</w:t>
+        <w:t xml:space="preserve">All runtime dependencies are pinned in </w:t>
       </w:r>
       <w:r>
         <w:rPr>
           <w:rFonts w:ascii="Consolas" w:hAnsi="Consolas"/>
           <w:sz w:val="22"/>
         </w:rPr>
-        <w:t>main.py</w:t>
-      </w:r>
-      <w:r>
-        <w:rPr>
-          <w:sz w:val="22"/>
-        </w:rPr>
-        <w:t xml:space="preserve"> lines 253 to 259) and would catch any future divergence. Earlier in development this same check caught a real bug, where an off-by-scale on the salary matching constraint in the CP-SAT model produced a different result from CBC on a borderline instance.</w:t>
+        <w:t>requirements.txt</w:t>
+      </w:r>
+      <w:r>
+        <w:rPr>
+          <w:sz w:val="22"/>
+        </w:rPr>
+        <w:t xml:space="preserve">. The list is </w:t>
+      </w:r>
+      <w:r>
+        <w:rPr>
+          <w:rFonts w:ascii="Consolas" w:hAnsi="Consolas"/>
+          <w:sz w:val="22"/>
+        </w:rPr>
+        <w:t>streamlit</w:t>
+      </w:r>
+      <w:r>
+        <w:rPr>
+          <w:sz w:val="22"/>
+        </w:rPr>
+        <w:t xml:space="preserve"> (UI), </w:t>
+      </w:r>
+      <w:r>
+        <w:rPr>
+          <w:rFonts w:ascii="Consolas" w:hAnsi="Consolas"/>
+          <w:sz w:val="22"/>
+        </w:rPr>
+        <w:t>plotly</w:t>
+      </w:r>
+      <w:r>
+        <w:rPr>
+          <w:sz w:val="22"/>
+        </w:rPr>
+        <w:t xml:space="preserve"> (UI charts), </w:t>
+      </w:r>
+      <w:r>
+        <w:rPr>
+          <w:rFonts w:ascii="Consolas" w:hAnsi="Consolas"/>
+          <w:sz w:val="22"/>
+        </w:rPr>
+        <w:t>nba_api</w:t>
+      </w:r>
+      <w:r>
+        <w:rPr>
+          <w:sz w:val="22"/>
+        </w:rPr>
+        <w:t xml:space="preserve"> (live rosters), </w:t>
+      </w:r>
+      <w:r>
+        <w:rPr>
+          <w:rFonts w:ascii="Consolas" w:hAnsi="Consolas"/>
+          <w:sz w:val="22"/>
+        </w:rPr>
+        <w:t>python-sat</w:t>
+      </w:r>
+      <w:r>
+        <w:rPr>
+          <w:sz w:val="22"/>
+        </w:rPr>
+        <w:t xml:space="preserve"> (PicoSAT and other backends), </w:t>
+      </w:r>
+      <w:r>
+        <w:rPr>
+          <w:rFonts w:ascii="Consolas" w:hAnsi="Consolas"/>
+          <w:sz w:val="22"/>
+        </w:rPr>
+        <w:t>ortools</w:t>
+      </w:r>
+      <w:r>
+        <w:rPr>
+          <w:sz w:val="22"/>
+        </w:rPr>
+        <w:t xml:space="preserve"> (CP-SAT), </w:t>
+      </w:r>
+      <w:r>
+        <w:rPr>
+          <w:rFonts w:ascii="Consolas" w:hAnsi="Consolas"/>
+          <w:sz w:val="22"/>
+        </w:rPr>
+        <w:t>pulp</w:t>
+      </w:r>
+      <w:r>
+        <w:rPr>
+          <w:sz w:val="22"/>
+        </w:rPr>
+        <w:t xml:space="preserve"> (MIP modeling with the CBC backend), </w:t>
+      </w:r>
+      <w:r>
+        <w:rPr>
+          <w:rFonts w:ascii="Consolas" w:hAnsi="Consolas"/>
+          <w:sz w:val="22"/>
+        </w:rPr>
+        <w:t>scikit-learn</w:t>
+      </w:r>
+      <w:r>
+        <w:rPr>
+          <w:sz w:val="22"/>
+        </w:rPr>
+        <w:t xml:space="preserve"> (the GBT regressor), </w:t>
+      </w:r>
+      <w:r>
+        <w:rPr>
+          <w:rFonts w:ascii="Consolas" w:hAnsi="Consolas"/>
+          <w:sz w:val="22"/>
+        </w:rPr>
+        <w:t>pandas</w:t>
+      </w:r>
+      <w:r>
+        <w:rPr>
+          <w:sz w:val="22"/>
+        </w:rPr>
+        <w:t xml:space="preserve"> and </w:t>
+      </w:r>
+      <w:r>
+        <w:rPr>
+          <w:rFonts w:ascii="Consolas" w:hAnsi="Consolas"/>
+          <w:sz w:val="22"/>
+        </w:rPr>
+        <w:t>numpy</w:t>
+      </w:r>
+      <w:r>
+        <w:rPr>
+          <w:sz w:val="22"/>
+        </w:rPr>
+        <w:t xml:space="preserve"> and </w:t>
+      </w:r>
+      <w:r>
+        <w:rPr>
+          <w:rFonts w:ascii="Consolas" w:hAnsi="Consolas"/>
+          <w:sz w:val="22"/>
+        </w:rPr>
+        <w:t>pyarrow</w:t>
+      </w:r>
+      <w:r>
+        <w:rPr>
+          <w:sz w:val="22"/>
+        </w:rPr>
+        <w:t xml:space="preserve"> (data handling), </w:t>
+      </w:r>
+      <w:r>
+        <w:rPr>
+          <w:rFonts w:ascii="Consolas" w:hAnsi="Consolas"/>
+          <w:sz w:val="22"/>
+        </w:rPr>
+        <w:t>requests</w:t>
+      </w:r>
+      <w:r>
+        <w:rPr>
+          <w:sz w:val="22"/>
+        </w:rPr>
+        <w:t xml:space="preserve"> (HTTP for BBR), and </w:t>
+      </w:r>
+      <w:r>
+        <w:rPr>
+          <w:rFonts w:ascii="Consolas" w:hAnsi="Consolas"/>
+          <w:sz w:val="22"/>
+        </w:rPr>
+        <w:t>matplotlib</w:t>
+      </w:r>
+      <w:r>
+        <w:rPr>
+          <w:sz w:val="22"/>
+        </w:rPr>
+        <w:t xml:space="preserve"> (transitively from scikit-learn, used for the benchmark charts). Two optional dependencies are needed only if a grader wants to rebuild the report files from </w:t>
+      </w:r>
+      <w:r>
+        <w:rPr>
+          <w:rFonts w:ascii="Consolas" w:hAnsi="Consolas"/>
+          <w:sz w:val="22"/>
+        </w:rPr>
+        <w:t>REPORT.md</w:t>
+      </w:r>
+      <w:r>
+        <w:rPr>
+          <w:sz w:val="22"/>
+        </w:rPr>
+        <w:t xml:space="preserve">: </w:t>
+      </w:r>
+      <w:r>
+        <w:rPr>
+          <w:rFonts w:ascii="Consolas" w:hAnsi="Consolas"/>
+          <w:sz w:val="22"/>
+        </w:rPr>
+        <w:t>reportlab</w:t>
+      </w:r>
+      <w:r>
+        <w:rPr>
+          <w:sz w:val="22"/>
+        </w:rPr>
+        <w:t xml:space="preserve"> for the PDF and </w:t>
+      </w:r>
+      <w:r>
+        <w:rPr>
+          <w:rFonts w:ascii="Consolas" w:hAnsi="Consolas"/>
+          <w:sz w:val="22"/>
+        </w:rPr>
+        <w:t>python-docx</w:t>
+      </w:r>
+      <w:r>
+        <w:rPr>
+          <w:sz w:val="22"/>
+        </w:rPr>
+        <w:t xml:space="preserve"> for the Word file. Both are listed at the top of </w:t>
+      </w:r>
+      <w:r>
+        <w:rPr>
+          <w:rFonts w:ascii="Consolas" w:hAnsi="Consolas"/>
+          <w:sz w:val="22"/>
+        </w:rPr>
+        <w:t>make_report.py</w:t>
+      </w:r>
+      <w:r>
+        <w:rPr>
+          <w:sz w:val="22"/>
+        </w:rPr>
+        <w:t xml:space="preserve"> and </w:t>
+      </w:r>
+      <w:r>
+        <w:rPr>
+          <w:rFonts w:ascii="Consolas" w:hAnsi="Consolas"/>
+          <w:sz w:val="22"/>
+        </w:rPr>
+        <w:t>make_word.py</w:t>
+      </w:r>
+      <w:r>
+        <w:rPr>
+          <w:sz w:val="22"/>
+        </w:rPr>
+        <w:t>.</w:t>
+      </w:r>
+    </w:p>
+    <w:p>
+      <w:pPr>
+        <w:spacing w:after="120" w:before="0"/>
+        <w:jc w:val="left"/>
+      </w:pPr>
+      <w:r>
+        <w:rPr>
+          <w:sz w:val="22"/>
+        </w:rPr>
+        <w:t xml:space="preserve">Install everything with </w:t>
+      </w:r>
+      <w:r>
+        <w:rPr>
+          <w:rFonts w:ascii="Consolas" w:hAnsi="Consolas"/>
+          <w:sz w:val="22"/>
+        </w:rPr>
+        <w:t>pip install -r requirements.txt</w:t>
+      </w:r>
+      <w:r>
+        <w:rPr>
+          <w:sz w:val="22"/>
+        </w:rPr>
+        <w:t>. Python 3.10 or newer is required because of f-string and dataclass syntax used throughout.</w:t>
       </w:r>
     </w:p>
     <w:p>
@@ -792,7 +1657,473 @@
           <w:color w:val="2C3E7A"/>
           <w:sz w:val="23"/>
         </w:rPr>
-        <w:t>4.2 Solve Time</w:t>
+        <w:t>4.3 How to Run</w:t>
+      </w:r>
+    </w:p>
+    <w:p>
+      <w:pPr>
+        <w:spacing w:after="120" w:before="0"/>
+        <w:jc w:val="left"/>
+      </w:pPr>
+      <w:r>
+        <w:rPr>
+          <w:sz w:val="22"/>
+        </w:rPr>
+        <w:t>The CLI demo runs the full pipeline end-to-end and is the simplest way to confirm everything is wired up correctly. From the project root:</w:t>
+      </w:r>
+    </w:p>
+    <w:p>
+      <w:pPr>
+        <w:spacing w:after="120" w:before="0"/>
+        <w:jc w:val="left"/>
+      </w:pPr>
+      <w:r>
+        <w:rPr>
+          <w:rFonts w:ascii="Consolas" w:hAnsi="Consolas"/>
+          <w:sz w:val="22"/>
+        </w:rPr>
+        <w:t>python3 main.py</w:t>
+      </w:r>
+    </w:p>
+    <w:p>
+      <w:pPr>
+        <w:spacing w:after="120" w:before="0"/>
+        <w:jc w:val="left"/>
+      </w:pPr>
+      <w:r>
+        <w:rPr>
+          <w:sz w:val="22"/>
+        </w:rPr>
+        <w:t xml:space="preserve">This prints the Lakers/Nets trade flowing through the SAT and MIP layers, the solver agreement check between OR-Tools CP-SAT and PuLP/CBC, the constraint-toggle demo (Section 6b in </w:t>
+      </w:r>
+      <w:r>
+        <w:rPr>
+          <w:rFonts w:ascii="Consolas" w:hAnsi="Consolas"/>
+          <w:sz w:val="22"/>
+        </w:rPr>
+        <w:t>main.py</w:t>
+      </w:r>
+      <w:r>
+        <w:rPr>
+          <w:sz w:val="22"/>
+        </w:rPr>
+        <w:t xml:space="preserve">), and the 5-instance benchmark table (Section 7 in </w:t>
+      </w:r>
+      <w:r>
+        <w:rPr>
+          <w:rFonts w:ascii="Consolas" w:hAnsi="Consolas"/>
+          <w:sz w:val="22"/>
+        </w:rPr>
+        <w:t>main.py</w:t>
+      </w:r>
+      <w:r>
+        <w:rPr>
+          <w:sz w:val="22"/>
+        </w:rPr>
+        <w:t>). Output is plain text and the run takes about three seconds after the GBT model is trained once at startup.</w:t>
+      </w:r>
+    </w:p>
+    <w:p>
+      <w:pPr>
+        <w:spacing w:after="120" w:before="0"/>
+        <w:jc w:val="left"/>
+      </w:pPr>
+      <w:r>
+        <w:rPr>
+          <w:sz w:val="22"/>
+        </w:rPr>
+        <w:t>The Streamlit UI runs the same back-end with an interactive interface:</w:t>
+      </w:r>
+    </w:p>
+    <w:p>
+      <w:pPr>
+        <w:spacing w:after="120" w:before="0"/>
+        <w:jc w:val="left"/>
+      </w:pPr>
+      <w:r>
+        <w:rPr>
+          <w:rFonts w:ascii="Consolas" w:hAnsi="Consolas"/>
+          <w:sz w:val="22"/>
+        </w:rPr>
+        <w:t>python3 -m streamlit run app.py</w:t>
+      </w:r>
+    </w:p>
+    <w:p>
+      <w:pPr>
+        <w:spacing w:after="120" w:before="0"/>
+        <w:jc w:val="left"/>
+      </w:pPr>
+      <w:r>
+        <w:rPr>
+          <w:sz w:val="22"/>
+        </w:rPr>
+        <w:t xml:space="preserve">On the first launch the data fetcher pulls all 30 teams from Basketball-Reference, which takes about 25 seconds because BBR rate-limits and the fetcher politely throttles requests. Subsequent launches read the parquet cache under </w:t>
+      </w:r>
+      <w:r>
+        <w:rPr>
+          <w:rFonts w:ascii="Consolas" w:hAnsi="Consolas"/>
+          <w:sz w:val="22"/>
+        </w:rPr>
+        <w:t>.cache/</w:t>
+      </w:r>
+      <w:r>
+        <w:rPr>
+          <w:sz w:val="22"/>
+        </w:rPr>
+        <w:t xml:space="preserve"> and start in about two seconds. No API keys or environment variables are required.</w:t>
+      </w:r>
+    </w:p>
+    <w:p>
+      <w:pPr>
+        <w:spacing w:after="120" w:before="0"/>
+        <w:jc w:val="left"/>
+      </w:pPr>
+      <w:r>
+        <w:rPr>
+          <w:sz w:val="22"/>
+        </w:rPr>
+        <w:t>The full benchmark sweep (the source of every number and chart in Section 5):</w:t>
+      </w:r>
+    </w:p>
+    <w:p>
+      <w:pPr>
+        <w:spacing w:after="120" w:before="0"/>
+        <w:jc w:val="left"/>
+      </w:pPr>
+      <w:r>
+        <w:rPr>
+          <w:rFonts w:ascii="Consolas" w:hAnsi="Consolas"/>
+          <w:sz w:val="22"/>
+        </w:rPr>
+        <w:t>python3 benchmark_sweep.py</w:t>
+      </w:r>
+    </w:p>
+    <w:p>
+      <w:pPr>
+        <w:spacing w:after="120" w:before="0"/>
+        <w:jc w:val="left"/>
+      </w:pPr>
+      <w:r>
+        <w:rPr>
+          <w:sz w:val="22"/>
+        </w:rPr>
+        <w:t xml:space="preserve">This takes about 15 seconds end-to-end on a laptop. It writes </w:t>
+      </w:r>
+      <w:r>
+        <w:rPr>
+          <w:rFonts w:ascii="Consolas" w:hAnsi="Consolas"/>
+          <w:sz w:val="22"/>
+        </w:rPr>
+        <w:t>benchmark_results_tightness.csv</w:t>
+      </w:r>
+      <w:r>
+        <w:rPr>
+          <w:sz w:val="22"/>
+        </w:rPr>
+        <w:t xml:space="preserve">, </w:t>
+      </w:r>
+      <w:r>
+        <w:rPr>
+          <w:rFonts w:ascii="Consolas" w:hAnsi="Consolas"/>
+          <w:sz w:val="22"/>
+        </w:rPr>
+        <w:t>benchmark_results_size.csv</w:t>
+      </w:r>
+      <w:r>
+        <w:rPr>
+          <w:sz w:val="22"/>
+        </w:rPr>
+        <w:t>, and three PNG charts to the project root, regenerating exactly the data and figures referenced in this report.</w:t>
+      </w:r>
+    </w:p>
+    <w:p>
+      <w:pPr>
+        <w:spacing w:after="120" w:before="0"/>
+        <w:jc w:val="left"/>
+      </w:pPr>
+      <w:r>
+        <w:rPr>
+          <w:sz w:val="22"/>
+        </w:rPr>
+        <w:t xml:space="preserve">To rebuild the report files themselves from </w:t>
+      </w:r>
+      <w:r>
+        <w:rPr>
+          <w:rFonts w:ascii="Consolas" w:hAnsi="Consolas"/>
+          <w:sz w:val="22"/>
+        </w:rPr>
+        <w:t>REPORT.md</w:t>
+      </w:r>
+      <w:r>
+        <w:rPr>
+          <w:sz w:val="22"/>
+        </w:rPr>
+        <w:t>:</w:t>
+      </w:r>
+    </w:p>
+    <w:p>
+      <w:pPr>
+        <w:spacing w:after="120" w:before="0"/>
+        <w:jc w:val="left"/>
+      </w:pPr>
+      <w:r>
+        <w:rPr>
+          <w:rFonts w:ascii="Consolas" w:hAnsi="Consolas"/>
+          <w:sz w:val="22"/>
+        </w:rPr>
+        <w:t>python3 make_report.py</w:t>
+      </w:r>
+      <w:r>
+        <w:rPr>
+          <w:sz w:val="22"/>
+        </w:rPr>
+        <w:t xml:space="preserve"> writes </w:t>
+      </w:r>
+      <w:r>
+        <w:rPr>
+          <w:rFonts w:ascii="Consolas" w:hAnsi="Consolas"/>
+          <w:sz w:val="22"/>
+        </w:rPr>
+        <w:t>REPORT.pdf</w:t>
+      </w:r>
+      <w:r>
+        <w:rPr>
+          <w:sz w:val="22"/>
+        </w:rPr>
+        <w:t xml:space="preserve">. </w:t>
+      </w:r>
+      <w:r>
+        <w:rPr>
+          <w:rFonts w:ascii="Consolas" w:hAnsi="Consolas"/>
+          <w:sz w:val="22"/>
+        </w:rPr>
+        <w:t>python3 make_word.py</w:t>
+      </w:r>
+      <w:r>
+        <w:rPr>
+          <w:sz w:val="22"/>
+        </w:rPr>
+        <w:t xml:space="preserve"> writes </w:t>
+      </w:r>
+      <w:r>
+        <w:rPr>
+          <w:rFonts w:ascii="Consolas" w:hAnsi="Consolas"/>
+          <w:sz w:val="22"/>
+        </w:rPr>
+        <w:t>REPORT.docx</w:t>
+      </w:r>
+      <w:r>
+        <w:rPr>
+          <w:sz w:val="22"/>
+        </w:rPr>
+        <w:t>.</w:t>
+      </w:r>
+    </w:p>
+    <w:p>
+      <w:pPr>
+        <w:spacing w:after="80" w:before="200"/>
+        <w:jc w:val="left"/>
+      </w:pPr>
+      <w:r>
+        <w:rPr>
+          <w:b/>
+          <w:color w:val="2C3E7A"/>
+          <w:sz w:val="23"/>
+        </w:rPr>
+        <w:t>4.4 Tests</w:t>
+      </w:r>
+    </w:p>
+    <w:p>
+      <w:pPr>
+        <w:spacing w:after="120" w:before="0"/>
+        <w:jc w:val="left"/>
+      </w:pPr>
+      <w:r>
+        <w:rPr>
+          <w:sz w:val="22"/>
+        </w:rPr>
+        <w:t xml:space="preserve">We did not write a formal pytest suite. What we have instead, which is closer to how an optimizer should actually be tested, is a property-based check that runs on every invocation of the pipeline. Any time </w:t>
+      </w:r>
+      <w:r>
+        <w:rPr>
+          <w:rFonts w:ascii="Consolas" w:hAnsi="Consolas"/>
+          <w:sz w:val="22"/>
+        </w:rPr>
+        <w:t>solve_both</w:t>
+      </w:r>
+      <w:r>
+        <w:rPr>
+          <w:sz w:val="22"/>
+        </w:rPr>
+        <w:t xml:space="preserve"> is called, both CP-SAT and CBC are run against the same constraints and their objectives are compared. If they disagree by more than 1e-2, </w:t>
+      </w:r>
+      <w:r>
+        <w:rPr>
+          <w:rFonts w:ascii="Consolas" w:hAnsi="Consolas"/>
+          <w:sz w:val="22"/>
+        </w:rPr>
+        <w:t>main.py</w:t>
+      </w:r>
+      <w:r>
+        <w:rPr>
+          <w:sz w:val="22"/>
+        </w:rPr>
+        <w:t xml:space="preserve"> lines 253 to 259 print a warning. This caught one real bug during development, when an early version of the CP-SAT model used wrong scaling on the salary matching constraint and CBC and CP-SAT diverged on a borderline instance. The agreement check surfaced it on the very next run.</w:t>
+      </w:r>
+    </w:p>
+    <w:p>
+      <w:pPr>
+        <w:spacing w:after="120" w:before="0"/>
+        <w:jc w:val="left"/>
+      </w:pPr>
+      <w:r>
+        <w:rPr>
+          <w:sz w:val="22"/>
+        </w:rPr>
+        <w:t xml:space="preserve">The benchmark sweep also tags every generated instance with </w:t>
+      </w:r>
+      <w:r>
+        <w:rPr>
+          <w:rFonts w:ascii="Consolas" w:hAnsi="Consolas"/>
+          <w:sz w:val="22"/>
+        </w:rPr>
+        <w:t>expected_feasible</w:t>
+      </w:r>
+      <w:r>
+        <w:rPr>
+          <w:sz w:val="22"/>
+        </w:rPr>
+        <w:t xml:space="preserve"> based on how much slack the generator built in, and confirms that against the observed SAT-layer verdict. Across all 820 instances we have generated, the expected and observed feasibility have agreed every time.</w:t>
+      </w:r>
+    </w:p>
+    <w:p>
+      <w:pPr>
+        <w:spacing w:after="120" w:before="0"/>
+        <w:jc w:val="left"/>
+      </w:pPr>
+      <w:r>
+        <w:rPr>
+          <w:sz w:val="22"/>
+        </w:rPr>
+        <w:t>These two checks are described in more detail in Section 7.</w:t>
+      </w:r>
+    </w:p>
+    <w:p>
+      <w:pPr>
+        <w:spacing w:after="120" w:before="280"/>
+        <w:jc w:val="left"/>
+      </w:pPr>
+      <w:r>
+        <w:rPr>
+          <w:b/>
+          <w:color w:val="1A1A2E"/>
+          <w:sz w:val="28"/>
+        </w:rPr>
+        <w:t>5. Experimentation and Results</w:t>
+      </w:r>
+    </w:p>
+    <w:p>
+      <w:pPr>
+        <w:spacing w:after="120" w:before="0"/>
+        <w:jc w:val="left"/>
+      </w:pPr>
+      <w:r>
+        <w:rPr>
+          <w:sz w:val="22"/>
+        </w:rPr>
+        <w:t xml:space="preserve">All numbers in this section come from </w:t>
+      </w:r>
+      <w:r>
+        <w:rPr>
+          <w:rFonts w:ascii="Consolas" w:hAnsi="Consolas"/>
+          <w:sz w:val="22"/>
+        </w:rPr>
+        <w:t>benchmark_sweep.py</w:t>
+      </w:r>
+      <w:r>
+        <w:rPr>
+          <w:sz w:val="22"/>
+        </w:rPr>
+        <w:t xml:space="preserve">, which generates 820 random trade instances total: 550 in a constraint-tightness sweep (50 instances at each of 11 tightness levels from 0.0 to 1.0) and 270 in a candidate-pool-size sweep (30 instances at each pool size from 2 to 10 players per team, with tightness fixed at 0.3). Raw per-instance results are written to </w:t>
+      </w:r>
+      <w:r>
+        <w:rPr>
+          <w:rFonts w:ascii="Consolas" w:hAnsi="Consolas"/>
+          <w:sz w:val="22"/>
+        </w:rPr>
+        <w:t>benchmark_results_tightness.csv</w:t>
+      </w:r>
+      <w:r>
+        <w:rPr>
+          <w:sz w:val="22"/>
+        </w:rPr>
+        <w:t xml:space="preserve"> and </w:t>
+      </w:r>
+      <w:r>
+        <w:rPr>
+          <w:rFonts w:ascii="Consolas" w:hAnsi="Consolas"/>
+          <w:sz w:val="22"/>
+        </w:rPr>
+        <w:t>benchmark_results_size.csv</w:t>
+      </w:r>
+      <w:r>
+        <w:rPr>
+          <w:sz w:val="22"/>
+        </w:rPr>
+        <w:t>.</w:t>
+      </w:r>
+    </w:p>
+    <w:p>
+      <w:pPr>
+        <w:spacing w:after="80" w:before="200"/>
+        <w:jc w:val="left"/>
+      </w:pPr>
+      <w:r>
+        <w:rPr>
+          <w:b/>
+          <w:color w:val="2C3E7A"/>
+          <w:sz w:val="23"/>
+        </w:rPr>
+        <w:t>5.1 Solver Agreement</w:t>
+      </w:r>
+    </w:p>
+    <w:p>
+      <w:pPr>
+        <w:spacing w:after="120" w:before="0"/>
+        <w:jc w:val="left"/>
+      </w:pPr>
+      <w:r>
+        <w:rPr>
+          <w:sz w:val="22"/>
+        </w:rPr>
+        <w:t>The most basic experiment: do CP-SAT and CBC find the same optimum on the same problem? On every instance where both solvers found a feasible trade, they agreed on the objective value to within 1e-2. This includes every instance in both sweeps. The agreement rate matches the MIP-feasibility rate exactly because when one solver succeeds the other also succeeds, and they always agree on the result. The agreement check is wired directly into the pipeline (</w:t>
+      </w:r>
+      <w:r>
+        <w:rPr>
+          <w:rFonts w:ascii="Consolas" w:hAnsi="Consolas"/>
+          <w:sz w:val="22"/>
+        </w:rPr>
+        <w:t>main.py</w:t>
+      </w:r>
+      <w:r>
+        <w:rPr>
+          <w:sz w:val="22"/>
+        </w:rPr>
+        <w:t xml:space="preserve"> lines 253 to 259) and would catch any future divergence. Earlier in development this same check caught a real bug, where an off-by-scale on the salary matching constraint in the CP-SAT model produced a different result from CBC on a borderline instance.</w:t>
+      </w:r>
+    </w:p>
+    <w:p>
+      <w:pPr>
+        <w:spacing w:after="80" w:before="200"/>
+        <w:jc w:val="left"/>
+      </w:pPr>
+      <w:r>
+        <w:rPr>
+          <w:b/>
+          <w:color w:val="2C3E7A"/>
+          <w:sz w:val="23"/>
+        </w:rPr>
+        <w:t>5.2 Solve Time</w:t>
       </w:r>
     </w:p>
     <w:p>
@@ -883,7 +2214,7 @@
           <w:color w:val="2C3E7A"/>
           <w:sz w:val="23"/>
         </w:rPr>
-        <w:t>4.3 SAT Almost Always Satisfies; Salary Matching is the Real Constraint</w:t>
+        <w:t>5.3 SAT Almost Always Satisfies; Salary Matching is the Real Constraint</w:t>
       </w:r>
     </w:p>
     <w:p>
@@ -998,7 +2329,7 @@
           <w:color w:val="2C3E7A"/>
           <w:sz w:val="23"/>
         </w:rPr>
-        <w:t>4.4 SAT Preprocessing Reduces MIP Work</w:t>
+        <w:t>5.4 SAT Preprocessing Reduces MIP Work</w:t>
       </w:r>
     </w:p>
     <w:p>
@@ -1077,7 +2408,7 @@
           <w:color w:val="2C3E7A"/>
           <w:sz w:val="23"/>
         </w:rPr>
-        <w:t>4.5 User-Configurable Constraints</w:t>
+        <w:t>5.5 User-Configurable Constraints</w:t>
       </w:r>
     </w:p>
     <w:p>
@@ -1128,7 +2459,7 @@
           <w:color w:val="1A1A2E"/>
           <w:sz w:val="28"/>
         </w:rPr>
-        <w:t>5. Performance Analysis</w:t>
+        <w:t>6. Performance Analysis</w:t>
       </w:r>
     </w:p>
     <w:p>
@@ -1178,7 +2509,7 @@
           <w:color w:val="1A1A2E"/>
           <w:sz w:val="28"/>
         </w:rPr>
-        <w:t>6. Testing</w:t>
+        <w:t>7. Testing</w:t>
       </w:r>
     </w:p>
     <w:p>
@@ -1293,7 +2624,7 @@
           <w:color w:val="1A1A2E"/>
           <w:sz w:val="28"/>
         </w:rPr>
-        <w:t>7. Limitations and Future Work</w:t>
+        <w:t>8. Limitations and Future Work</w:t>
       </w:r>
     </w:p>
     <w:p>
@@ -1381,7 +2712,7 @@
           <w:color w:val="1A1A2E"/>
           <w:sz w:val="28"/>
         </w:rPr>
-        <w:t>8. Conclusion</w:t>
+        <w:t>9. Conclusion</w:t>
       </w:r>
     </w:p>
     <w:p>
@@ -1405,7 +2736,7 @@
         <w:rPr>
           <w:sz w:val="22"/>
         </w:rPr>
-        <w:t>Of the six novelty criteria, five are cleanly addressed (real-world dataset, three solver implementations, parameterized instance generator, user-configurable constraints, multiple techniques combined). Formal hardness analysis is the one we only partially covered, through the tightness and size sweeps in Section 4.</w:t>
+        <w:t>Of the six novelty criteria, five are cleanly addressed (real-world dataset, three solver implementations, parameterized instance generator, user-configurable constraints, multiple techniques combined). Formal hardness analysis is the one we only partially covered, through the tightness and size sweeps in Section 5.</w:t>
       </w:r>
     </w:p>
     <w:sectPr>

</xml_diff>